<commit_message>
Add employee creation response and deletion; update project documentation
</commit_message>
<xml_diff>
--- a/PROJECT_NOTES.docx
+++ b/PROJECT_NOTES.docx
@@ -124,6 +124,14 @@
     </w:p>
     <w:p>
       <w:pPr>
+        <w:pStyle w:val="ListText"/>
+      </w:pPr>
+      <w:r>
+        <w:t xml:space="preserve">13. Delete employee execution flow</w:t>
+      </w:r>
+    </w:p>
+    <w:p>
+      <w:pPr>
         <w:pStyle w:val="Heading1"/>
       </w:pPr>
       <w:r>
@@ -135,7 +143,7 @@
         <w:pStyle w:val="Normal"/>
       </w:pPr>
       <w:r>
-        <w:t xml:space="preserve">employee-command-service is a Spring Boot REST application that writes employee data to PostgreSQL. Its two business operations are creating an employee and changing an existing employee's email.</w:t>
+        <w:t xml:space="preserve">employee-command-service is a Spring Boot REST application that writes employee data to PostgreSQL. Its three business operations are creating an employee, changing an existing employee's email, and deleting an employee.</w:t>
       </w:r>
     </w:p>
     <w:tbl>
@@ -223,7 +231,7 @@
               <w:pStyle w:val="TableText"/>
             </w:pPr>
             <w:r>
-              <w:t xml:space="preserve">Saves first name, last name, and email with a generated ID</w:t>
+              <w:t xml:space="preserve">Saves the employee and returns 201 Created with name and email, without the generated ID</w:t>
             </w:r>
           </w:p>
         </w:tc>
@@ -269,13 +277,54 @@
           </w:p>
         </w:tc>
       </w:tr>
+      <w:tr>
+        <w:tc>
+          <w:tcPr>
+            <w:tcW w:w="0" w:type="auto"/>
+          </w:tcPr>
+          <w:p>
+            <w:pPr>
+              <w:pStyle w:val="TableText"/>
+            </w:pPr>
+            <w:r>
+              <w:t xml:space="preserve">Delete employee</w:t>
+            </w:r>
+          </w:p>
+        </w:tc>
+        <w:tc>
+          <w:tcPr>
+            <w:tcW w:w="0" w:type="auto"/>
+          </w:tcPr>
+          <w:p>
+            <w:pPr>
+              <w:pStyle w:val="TableText"/>
+            </w:pPr>
+            <w:r>
+              <w:t xml:space="preserve">DELETE /api/v1/employees/{id}</w:t>
+            </w:r>
+          </w:p>
+        </w:tc>
+        <w:tc>
+          <w:tcPr>
+            <w:tcW w:w="0" w:type="auto"/>
+          </w:tcPr>
+          <w:p>
+            <w:pPr>
+              <w:pStyle w:val="TableText"/>
+            </w:pPr>
+            <w:r>
+              <w:t xml:space="preserve">Finds the employee and removes its row; normally returns 200 OK with no body</w:t>
+            </w:r>
+          </w:p>
+        </w:tc>
+      </w:tr>
     </w:tbl>
     <w:p>
       <w:pPr>
         <w:pStyle w:val="Normal"/>
       </w:pPr>
       <w:r>
-        <w:t xml:space="preserve">There are no GET or DELETE endpoints, query service, message broker, or event publisher in the supplied source.</w:t>
+        <w:t xml:space="preserve">There is no GET endpoint, query service, message broker, or event publisher in the supplied source.</w:t>
       </w:r>
     </w:p>
     <w:p>
@@ -368,6 +417,34 @@
               <w:pStyle w:val="TableText"/>
             </w:pPr>
             <w:r>
+              <w:t xml:space="preserve">spring-boot-starter-jetty</w:t>
+            </w:r>
+          </w:p>
+        </w:tc>
+        <w:tc>
+          <w:tcPr>
+            <w:tcW w:w="0" w:type="auto"/>
+          </w:tcPr>
+          <w:p>
+            <w:pPr>
+              <w:pStyle w:val="TableText"/>
+            </w:pPr>
+            <w:r>
+              <w:t xml:space="preserve">Adds Jetty server support; the MVC dependency also excludes spring-boot-tomcat</w:t>
+            </w:r>
+          </w:p>
+        </w:tc>
+      </w:tr>
+      <w:tr>
+        <w:tc>
+          <w:tcPr>
+            <w:tcW w:w="0" w:type="auto"/>
+          </w:tcPr>
+          <w:p>
+            <w:pPr>
+              <w:pStyle w:val="TableText"/>
+            </w:pPr>
+            <w:r>
               <w:t xml:space="preserve">spring-boot-starter-data-jpa</w:t>
             </w:r>
           </w:p>
@@ -499,6 +576,14 @@
         </w:tc>
       </w:tr>
     </w:tbl>
+    <w:p>
+      <w:pPr>
+        <w:pStyle w:val="Normal"/>
+      </w:pPr>
+      <w:r>
+        <w:t xml:space="preserve">The Jetty dependency and Tomcat exclusion describe the current POM. The resolved runtime server has not been checked with a dependency tree or application startup.</w:t>
+      </w:r>
+    </w:p>
     <w:p>
       <w:pPr>
         <w:pStyle w:val="Heading2"/>
@@ -645,6 +730,34 @@
               <w:pStyle w:val="TableText"/>
             </w:pPr>
             <w:r>
+              <w:t xml:space="preserve">dto/EmployeeResponse.java (src/main/java/com/durga/employee/dto/EmployeeResponse.java)</w:t>
+            </w:r>
+          </w:p>
+        </w:tc>
+        <w:tc>
+          <w:tcPr>
+            <w:tcW w:w="0" w:type="auto"/>
+          </w:tcPr>
+          <w:p>
+            <w:pPr>
+              <w:pStyle w:val="TableText"/>
+            </w:pPr>
+            <w:r>
+              <w:t xml:space="preserve">Holds first name, last name, and email returned after creation; no ID field</w:t>
+            </w:r>
+          </w:p>
+        </w:tc>
+      </w:tr>
+      <w:tr>
+        <w:tc>
+          <w:tcPr>
+            <w:tcW w:w="0" w:type="auto"/>
+          </w:tcPr>
+          <w:p>
+            <w:pPr>
+              <w:pStyle w:val="TableText"/>
+            </w:pPr>
+            <w:r>
               <w:t xml:space="preserve">service/EmployeeService.java (src/main/java/com/durga/employee/service/EmployeeService.java)</w:t>
             </w:r>
           </w:p>
@@ -658,7 +771,7 @@
               <w:pStyle w:val="TableText"/>
             </w:pPr>
             <w:r>
-              <w:t xml:space="preserve">Defines the two application operations</w:t>
+              <w:t xml:space="preserve">Defines creation, update, and deletion operations</w:t>
             </w:r>
           </w:p>
         </w:tc>
@@ -686,7 +799,7 @@
               <w:pStyle w:val="TableText"/>
             </w:pPr>
             <w:r>
-              <w:t xml:space="preserve">Implements creation and update logic</w:t>
+              <w:t xml:space="preserve">Implements creation, update, and deletion logic</w:t>
             </w:r>
           </w:p>
         </w:tc>
@@ -958,7 +1071,7 @@
         <w:pStyle w:val="Normal"/>
       </w:pPr>
       <w:r>
-        <w:t xml:space="preserve">Only the first two command examples exist here. The remaining operations illustrate how the application could grow.</w:t>
+        <w:t xml:space="preserve">The first two command examples exist here, along with employee deletion. Deactivation is not implemented: deletion removes the row rather than marking it inactive. The query examples illustrate how the application could grow.</w:t>
       </w:r>
     </w:p>
     <w:p>
@@ -998,7 +1111,7 @@
         <w:pStyle w:val="Code"/>
       </w:pPr>
       <w:r>
-        <w:t xml:space="preserve">Client --POST / PUT--&gt; Command service --&gt; Write database</w:t>
+        <w:t xml:space="preserve">Client --POST / PUT / DELETE--&gt; Command service --&gt; Write database</w:t>
       </w:r>
     </w:p>
     <w:p>
@@ -1371,7 +1484,7 @@
         <w:pStyle w:val="Normal"/>
       </w:pPr>
       <w:r>
-        <w:t xml:space="preserve">Only save() and findById() are called by the current service. Repository methods do not automatically create REST endpoints.</w:t>
+        <w:t xml:space="preserve">The current service calls save(), findById(), and delete(employee). Although deleteById() is available, the deletion workflow first finds the employee and then passes that entity to delete(). Repository methods do not automatically create REST endpoints.</w:t>
       </w:r>
     </w:p>
     <w:p>
@@ -1959,7 +2072,7 @@
         <w:pStyle w:val="Normal"/>
       </w:pPr>
       <w:r>
-        <w:t xml:space="preserve">Both interfaces support the two methods currently used by this project. JpaRepository additionally makes JPA-specific capabilities available. Extending it does not automatically make queries faster, and saveAll() does not by itself guarantee JDBC batching.</w:t>
+        <w:t xml:space="preserve">Both interfaces support the persistence methods currently used by this project. JpaRepository additionally makes JPA-specific capabilities available. Extending it does not automatically make queries faster, and saveAll() does not by itself guarantee JDBC batching.</w:t>
       </w:r>
     </w:p>
     <w:p>
@@ -2753,6 +2866,30 @@
         <w:pStyle w:val="Heading2"/>
       </w:pPr>
       <w:r>
+        <w:t xml:space="preserve">EmployeeResponse: the output DTO</w:t>
+      </w:r>
+    </w:p>
+    <w:p>
+      <w:pPr>
+        <w:pStyle w:val="Normal"/>
+      </w:pPr>
+      <w:r>
+        <w:t xml:space="preserve">EmployeeResponse contains firstName, lastName, and email, with a three-argument constructor and explicit getters and setters. It has no ID field and no persistence annotations. The create service returns this DTO, and the controller uses ResponseEntity&lt;EmployeeResponse&gt; to set HTTP 201 Created and serialize the DTO as JSON. Update and delete return no response DTO.</w:t>
+      </w:r>
+    </w:p>
+    <w:p>
+      <w:pPr>
+        <w:pStyle w:val="Normal"/>
+      </w:pPr>
+      <w:r>
+        <w:t xml:space="preserve">The service stores the return value of save(employee) in employee2, but constructs the response from the original employee object. The saved return value is currently unused.</w:t>
+      </w:r>
+    </w:p>
+    <w:p>
+      <w:pPr>
+        <w:pStyle w:val="Heading2"/>
+      </w:pPr>
+      <w:r>
         <w:t xml:space="preserve">Employee: the persisted entity</w:t>
       </w:r>
     </w:p>
@@ -3199,15 +3336,55 @@
         <w:pStyle w:val="ListText"/>
       </w:pPr>
       <w:r>
-        <w:t xml:space="preserve">10. Both service and controller return void. With the current controller and normal Spring MVC handling, the successful HTTP response is 200 OK with an empty body.</w:t>
-      </w:r>
-    </w:p>
-    <w:p>
-      <w:pPr>
-        <w:pStyle w:val="Normal"/>
-      </w:pPr>
-      <w:r>
-        <w:t xml:space="preserve">The code does not explicitly send 201 Created, a Location header, or the generated employee ID.</w:t>
+        <w:t xml:space="preserve">10. The service builds an EmployeeResponse containing first name, last name, and email. The controller returns ResponseEntity.status(HttpStatus.CREATED).body(employeeResponse), producing 201 Created with a JSON body.</w:t>
+      </w:r>
+    </w:p>
+    <w:p>
+      <w:pPr>
+        <w:pStyle w:val="Normal"/>
+      </w:pPr>
+      <w:r>
+        <w:t xml:space="preserve">The code does not send a Location header or include the generated employee ID in the response.</w:t>
+      </w:r>
+    </w:p>
+    <w:p>
+      <w:pPr>
+        <w:pStyle w:val="Code"/>
+      </w:pPr>
+      <w:r>
+        <w:t xml:space="preserve">{</w:t>
+      </w:r>
+    </w:p>
+    <w:p>
+      <w:pPr>
+        <w:pStyle w:val="Code"/>
+      </w:pPr>
+      <w:r>
+        <w:t xml:space="preserve">  "firstName": "Anita",</w:t>
+      </w:r>
+    </w:p>
+    <w:p>
+      <w:pPr>
+        <w:pStyle w:val="Code"/>
+      </w:pPr>
+      <w:r>
+        <w:t xml:space="preserve">  "lastName": "Rao",</w:t>
+      </w:r>
+    </w:p>
+    <w:p>
+      <w:pPr>
+        <w:pStyle w:val="Code"/>
+      </w:pPr>
+      <w:r>
+        <w:t xml:space="preserve">  "email": "anita.rao@example.com"</w:t>
+      </w:r>
+    </w:p>
+    <w:p>
+      <w:pPr>
+        <w:pStyle w:val="Code"/>
+      </w:pPr>
+      <w:r>
+        <w:t xml:space="preserve">}</w:t>
       </w:r>
     </w:p>
     <w:p>
@@ -3255,7 +3432,15 @@
         <w:pStyle w:val="Code"/>
       </w:pPr>
       <w:r>
-        <w:t xml:space="preserve">employeeRepository.save(employee);</w:t>
+        <w:t xml:space="preserve">Employee employee2 = employeeRepository.save(employee);</w:t>
+      </w:r>
+    </w:p>
+    <w:p>
+      <w:pPr>
+        <w:pStyle w:val="Code"/>
+      </w:pPr>
+      <w:r>
+        <w:t xml:space="preserve">return new EmployeeResponse(employee.getFirstName(), employee.getLastName(), employee.getEmail());</w:t>
       </w:r>
     </w:p>
     <w:p>
@@ -4112,6 +4297,47 @@
               <w:pStyle w:val="TableText"/>
             </w:pPr>
             <w:r>
+              <w:t xml:space="preserve">@DeleteMapping("/{id}")</w:t>
+            </w:r>
+          </w:p>
+        </w:tc>
+        <w:tc>
+          <w:tcPr>
+            <w:tcW w:w="0" w:type="auto"/>
+          </w:tcPr>
+          <w:p>
+            <w:pPr>
+              <w:pStyle w:val="TableText"/>
+            </w:pPr>
+            <w:r>
+              <w:t xml:space="preserve">deleteEmployee</w:t>
+            </w:r>
+          </w:p>
+        </w:tc>
+        <w:tc>
+          <w:tcPr>
+            <w:tcW w:w="0" w:type="auto"/>
+          </w:tcPr>
+          <w:p>
+            <w:pPr>
+              <w:pStyle w:val="TableText"/>
+            </w:pPr>
+            <w:r>
+              <w:t xml:space="preserve">Handles DELETE with an employee ID in the URL</w:t>
+            </w:r>
+          </w:p>
+        </w:tc>
+      </w:tr>
+      <w:tr>
+        <w:tc>
+          <w:tcPr>
+            <w:tcW w:w="0" w:type="auto"/>
+          </w:tcPr>
+          <w:p>
+            <w:pPr>
+              <w:pStyle w:val="TableText"/>
+            </w:pPr>
+            <w:r>
               <w:t xml:space="preserve">@RequestBody</w:t>
             </w:r>
           </w:p>
@@ -4166,7 +4392,7 @@
               <w:pStyle w:val="TableText"/>
             </w:pPr>
             <w:r>
-              <w:t xml:space="preserve">PUT method's Long id parameter</w:t>
+              <w:t xml:space="preserve">PUT and DELETE methods' Long id parameters</w:t>
             </w:r>
           </w:p>
         </w:tc>
@@ -4222,7 +4448,7 @@
         <w:pStyle w:val="Normal"/>
       </w:pPr>
       <w:r>
-        <w:t xml:space="preserve">@Override — on the implementation's addEmployee() and updateEmployee(). This Java annotation lets the compiler verify that each method implements or overrides an inherited method. It is unrelated to Spring bean discovery.</w:t>
+        <w:t xml:space="preserve">@Override — on the implementation's addEmployee(), updateEmployee(), and deleteEmployee(). This Java annotation lets the compiler verify that each method implements or overrides an inherited method. It is unrelated to Spring bean discovery.</w:t>
       </w:r>
     </w:p>
     <w:p>
@@ -4607,7 +4833,7 @@
         <w:pStyle w:val="Normal"/>
       </w:pPr>
       <w:r>
-        <w:t xml:space="preserve">@Test, imported from JUnit Jupiter, identifies contextLoads() as a test method. Its empty body checks only that context loading succeeds. It does not verify either API's business behavior.</w:t>
+        <w:t xml:space="preserve">@Test, imported from JUnit Jupiter, identifies contextLoads() as a test method. Its empty body checks only that context loading succeeds. It does not verify the create, update, or delete API behavior.</w:t>
       </w:r>
     </w:p>
     <w:p>
@@ -4704,6 +4930,14 @@
       </w:pPr>
       <w:r>
         <w:t xml:space="preserve">Entity attachment between calls can depend on persistence-context configuration, including Open EntityManager in View. An open persistence context is not itself a service-wide database transaction.</w:t>
+      </w:r>
+    </w:p>
+    <w:p>
+      <w:pPr>
+        <w:pStyle w:val="Normal"/>
+      </w:pPr>
+      <w:r>
+        <w:t xml:space="preserve">The delete workflow also has separate findById() and delete(employee) repository calls without a service-level transaction. A concurrent change can occur between them; the source does not define a special concurrency response.</w:t>
       </w:r>
     </w:p>
     <w:p>
@@ -4768,7 +5002,7 @@
               <w:pStyle w:val="TableText"/>
             </w:pPr>
             <w:r>
-              <w:t xml:space="preserve">Missing employee ID in the database</w:t>
+              <w:t xml:space="preserve">Missing employee ID during update or deletion</w:t>
             </w:r>
           </w:p>
         </w:tc>
@@ -4968,7 +5202,7 @@
         <w:pStyle w:val="Normal"/>
       </w:pPr>
       <w:r>
-        <w:t xml:space="preserve">Potential improvements include request validation, a specific not-found exception mapped to 404, a duplicate-email response mapped to 409, and explicit success statuses. These notes document them without changing the application.</w:t>
+        <w:t xml:space="preserve">Potential improvements include request validation, a specific not-found exception mapped to 404, a duplicate-email response mapped to 409, and an explicit 204 No Content status for update and delete. Creation already explicitly returns 201 Created. These notes document possible improvements without changing the application.</w:t>
       </w:r>
     </w:p>
     <w:p>
@@ -5136,7 +5370,7 @@
         <w:pStyle w:val="Normal"/>
       </w:pPr>
       <w:r>
-        <w:t xml:space="preserve">An empty success response is expected. The generated ID is not returned by the API. Since there is no GET endpoint, inspect the row using a database client connected to employee_db:</w:t>
+        <w:t xml:space="preserve">A successful create returns 201 Created with first name, last name, and email as JSON. The generated ID is not returned by the API. Since there is no GET endpoint, inspect the row using a database client connected to employee_db:</w:t>
       </w:r>
     </w:p>
     <w:p>
@@ -5280,7 +5514,47 @@
         <w:pStyle w:val="Heading2"/>
       </w:pPr>
       <w:r>
-        <w:t xml:space="preserve">Existing test</w:t>
+        <w:t xml:space="preserve">Delete the employee</w:t>
+      </w:r>
+    </w:p>
+    <w:p>
+      <w:pPr>
+        <w:pStyle w:val="Normal"/>
+      </w:pPr>
+      <w:r>
+        <w:t xml:space="preserve">After checking the update, remove the employee using the actual ID:</w:t>
+      </w:r>
+    </w:p>
+    <w:p>
+      <w:pPr>
+        <w:pStyle w:val="Code"/>
+      </w:pPr>
+      <w:r>
+        <w:t xml:space="preserve">Invoke-RestMethod -Method Delete `</w:t>
+      </w:r>
+    </w:p>
+    <w:p>
+      <w:pPr>
+        <w:pStyle w:val="Code"/>
+      </w:pPr>
+      <w:r>
+        <w:t xml:space="preserve">    -Uri "http://localhost:8080/api/v1/employees/$employeeId"</w:t>
+      </w:r>
+    </w:p>
+    <w:p>
+      <w:pPr>
+        <w:pStyle w:val="Normal"/>
+      </w:pPr>
+      <w:r>
+        <w:t xml:space="preserve">Success normally has an empty 200 OK response. Run the same SELECT query to confirm the row is absent. Repeating the DELETE request reaches the missing-employee exception; no custom 404 response is configured.</w:t>
+      </w:r>
+    </w:p>
+    <w:p>
+      <w:pPr>
+        <w:pStyle w:val="Heading2"/>
+      </w:pPr>
+      <w:r>
+        <w:t xml:space="preserve">Run the existing test</w:t>
       </w:r>
     </w:p>
     <w:p>
@@ -5296,7 +5570,7 @@
         <w:pStyle w:val="Normal"/>
       </w:pPr>
       <w:r>
-        <w:t xml:space="preserve">The existing test only loads the context. It is not proof that creation, updates, missing IDs, or constraint failures behave correctly. Dedicated integration tests would be needed to verify those cases automatically.</w:t>
+        <w:t xml:space="preserve">The existing test only loads the context. It is not proof that creation, updates, deletion, missing IDs, or constraint failures behave correctly. Dedicated integration tests would be needed to verify those cases automatically.</w:t>
       </w:r>
     </w:p>
     <w:p>
@@ -5464,7 +5738,167 @@
         <w:pStyle w:val="Normal"/>
       </w:pPr>
       <w:r>
-        <w:t xml:space="preserve">No. It implements two command-side HTTP operations backed by a relational database. Separate queries, projections, and event delivery would require additional work.</w:t>
+        <w:t xml:space="preserve">No. It implements three command-side HTTP operations backed by a relational database. Separate queries, projections, and event delivery would require additional work.</w:t>
+      </w:r>
+    </w:p>
+    <w:p>
+      <w:pPr>
+        <w:pStyle w:val="Normal"/>
+      </w:pPr>
+      <w:r>
+        <w:t xml:space="preserve">What does creation return?</w:t>
+      </w:r>
+    </w:p>
+    <w:p>
+      <w:pPr>
+        <w:pStyle w:val="Normal"/>
+      </w:pPr>
+      <w:r>
+        <w:t xml:space="preserve">HTTP 201 Created with an EmployeeResponse containing first name, last name, and email. The generated ID and a Location header are not included.</w:t>
+      </w:r>
+    </w:p>
+    <w:p>
+      <w:pPr>
+        <w:pStyle w:val="Normal"/>
+      </w:pPr>
+      <w:r>
+        <w:t xml:space="preserve">Does deletion use deleteById() directly?</w:t>
+      </w:r>
+    </w:p>
+    <w:p>
+      <w:pPr>
+        <w:pStyle w:val="Normal"/>
+      </w:pPr>
+      <w:r>
+        <w:t xml:space="preserve">No. It finds the employee with findById(), throws if absent, and passes the found entity to delete(employee).</w:t>
+      </w:r>
+    </w:p>
+    <w:p>
+      <w:pPr>
+        <w:pStyle w:val="Heading1"/>
+      </w:pPr>
+      <w:r>
+        <w:t xml:space="preserve">13. Delete employee execution flow</w:t>
+      </w:r>
+    </w:p>
+    <w:p>
+      <w:pPr>
+        <w:pStyle w:val="Code"/>
+      </w:pPr>
+      <w:r>
+        <w:t xml:space="preserve">DELETE /api/v1/employees/1</w:t>
+      </w:r>
+    </w:p>
+    <w:p>
+      <w:pPr>
+        <w:pStyle w:val="ListText"/>
+      </w:pPr>
+      <w:r>
+        <w:t xml:space="preserve">1. @DeleteMapping("/{id}") selects EmployeeController.deleteEmployee(Long id).</w:t>
+      </w:r>
+    </w:p>
+    <w:p>
+      <w:pPr>
+        <w:pStyle w:val="ListText"/>
+      </w:pPr>
+      <w:r>
+        <w:t xml:space="preserve">2. @PathVariable converts the path ID to Long; no request body is required.</w:t>
+      </w:r>
+    </w:p>
+    <w:p>
+      <w:pPr>
+        <w:pStyle w:val="ListText"/>
+      </w:pPr>
+      <w:r>
+        <w:t xml:space="preserve">3. The controller calls employeeService.deleteEmployee(id).</w:t>
+      </w:r>
+    </w:p>
+    <w:p>
+      <w:pPr>
+        <w:pStyle w:val="ListText"/>
+      </w:pPr>
+      <w:r>
+        <w:t xml:space="preserve">4. The service calls employeeRepository.findById(id).</w:t>
+      </w:r>
+    </w:p>
+    <w:p>
+      <w:pPr>
+        <w:pStyle w:val="ListText"/>
+      </w:pPr>
+      <w:r>
+        <w:t xml:space="preserve">5. If absent, it throws RuntimeException("Employee Not Found wiht id: " + id), as the update method does.</w:t>
+      </w:r>
+    </w:p>
+    <w:p>
+      <w:pPr>
+        <w:pStyle w:val="ListText"/>
+      </w:pPr>
+      <w:r>
+        <w:t xml:space="preserve">6. If present, it calls employeeRepository.delete(employee) to remove the entity.</w:t>
+      </w:r>
+    </w:p>
+    <w:p>
+      <w:pPr>
+        <w:pStyle w:val="ListText"/>
+      </w:pPr>
+      <w:r>
+        <w:t xml:space="preserve">7. Both methods return void, so success normally produces 200 OK with an empty body. No explicit 204 status is set.</w:t>
+      </w:r>
+    </w:p>
+    <w:p>
+      <w:pPr>
+        <w:pStyle w:val="Code"/>
+      </w:pPr>
+      <w:r>
+        <w:t xml:space="preserve">Employee employee = employeeRepository.findById(id)</w:t>
+      </w:r>
+    </w:p>
+    <w:p>
+      <w:pPr>
+        <w:pStyle w:val="Code"/>
+      </w:pPr>
+      <w:r>
+        <w:t xml:space="preserve">    .orElseThrow(() -&gt; new RuntimeException("Employee Not Found wiht id: " + id));</w:t>
+      </w:r>
+    </w:p>
+    <w:p>
+      <w:pPr>
+        <w:pStyle w:val="Code"/>
+      </w:pPr>
+      <w:r>
+        <w:t xml:space="preserve">employeeRepository.delete(employee);</w:t>
+      </w:r>
+    </w:p>
+    <w:p>
+      <w:pPr>
+        <w:pStyle w:val="Normal"/>
+      </w:pPr>
+      <w:r>
+        <w:t xml:space="preserve">The conceptual database effect is:</w:t>
+      </w:r>
+    </w:p>
+    <w:p>
+      <w:pPr>
+        <w:pStyle w:val="Code"/>
+      </w:pPr>
+      <w:r>
+        <w:t xml:space="preserve">SELECT id, first_name, last_name, email FROM employees WHERE id = 1;</w:t>
+      </w:r>
+    </w:p>
+    <w:p>
+      <w:pPr>
+        <w:pStyle w:val="Code"/>
+      </w:pPr>
+      <w:r>
+        <w:t xml:space="preserve">DELETE FROM employees WHERE id = 1;</w:t>
+      </w:r>
+    </w:p>
+    <w:p>
+      <w:pPr>
+        <w:pStyle w:val="Normal"/>
+      </w:pPr>
+      <w:r>
+        <w:t xml:space="preserve">Actual SQL and statement count depend on Hibernate and persistence-context behavior. This is a physical deletion; there is no inactive flag, soft-delete mechanism, or deletion event in the implementation.</w:t>
       </w:r>
     </w:p>
     <w:sectPr>

</xml_diff>